<commit_message>
Anade despliegue continuo a GitHub Pages con GitHub Actions
.github/workflows/deploy.yml: en cada push a main (o manualmente con
workflow_dispatch) el job build hace checkout, setup-node 20, npm ci y
npm run build, y sube dist/ como artefacto de Pages; el job deploy lo
publica con actions/deploy-pages. Metodo "GitHub Actions" de Pages: sin
rama gh-pages, sin Jekyll. Permisos minimos y concurrency sobre el grupo
pages.

Paso manual pendiente (una vez): Settings > Pages > Source = GitHub Actions.

Actualiza la seccion 7 de la estrategia (.md/.docx y generar_docx.py) y la
seccion de despliegue del README.

Co-authored-by: AndresSc21 <163218074+AndresSc21@users.noreply.github.com>
Co-authored-by: SotoCarlos12 <146498623+SotoCarlos12@users.noreply.github.com>
</commit_message>
<xml_diff>
--- a/docs/estrategia_despliegue_MML.docx
+++ b/docs/estrategia_despliegue_MML.docx
@@ -2108,10 +2108,10 @@
       <w:r>
         <w:rPr>
           <w:b w:val="0"/>
-          <w:i/>
+          <w:i w:val="0"/>
           <w:sz w:val="22"/>
         </w:rPr>
-        <w:t>Descrito aquí como diseño; la implementación del workflow corresponde a la fase siguiente del curso.</w:t>
+        <w:t>Implementado en .github/workflows/deploy.yml (método “GitHub Actions” de Pages: sin rama gh-pages, sin Jekyll). Habilitación única: Settings → Pages → Source = GitHub Actions.</w:t>
       </w:r>
     </w:p>
     <w:p>
@@ -2121,7 +2121,7 @@
           <w:i w:val="0"/>
           <w:sz w:val="22"/>
         </w:rPr>
-        <w:t>Disparador: push a la rama main.</w:t>
+        <w:t>Disparador: push a la rama main (o ejecución manual con workflow_dispatch).</w:t>
       </w:r>
     </w:p>
     <w:p>
@@ -2135,11 +2135,13 @@
       </w:r>
     </w:p>
     <w:p>
-      <w:pPr>
-        <w:pStyle w:val="ListNumber"/>
-      </w:pPr>
       <w:r>
-        <w:t>Checkout — descarga del código.</w:t>
+        <w:rPr>
+          <w:b/>
+          <w:i w:val="0"/>
+          <w:sz w:val="22"/>
+        </w:rPr>
+        <w:t>Job build:</w:t>
       </w:r>
     </w:p>
     <w:p>
@@ -2147,7 +2149,15 @@
         <w:pStyle w:val="ListNumber"/>
       </w:pPr>
       <w:r>
-        <w:t>Preparar Node — Node 20, caché de npm.</w:t>
+        <w:t>Checkout — actions/checkout@v4.</w:t>
+      </w:r>
+    </w:p>
+    <w:p>
+      <w:pPr>
+        <w:pStyle w:val="ListNumber"/>
+      </w:pPr>
+      <w:r>
+        <w:t>Preparar Node — actions/setup-node@v4, Node 20, caché de npm.</w:t>
       </w:r>
     </w:p>
     <w:p>
@@ -2173,24 +2183,6 @@
         <w:pStyle w:val="ListNumber"/>
       </w:pPr>
       <w:r>
-        <w:t xml:space="preserve">(Recomendado) Lint — </w:t>
-      </w:r>
-      <w:r>
-        <w:rPr>
-          <w:rFonts w:ascii="Consolas" w:hAnsi="Consolas"/>
-          <w:sz w:val="20"/>
-        </w:rPr>
-        <w:t>npm run lint</w:t>
-      </w:r>
-      <w:r>
-        <w:t xml:space="preserve"> (Prettier/ESLint) para no publicar código con errores.</w:t>
-      </w:r>
-    </w:p>
-    <w:p>
-      <w:pPr>
-        <w:pStyle w:val="ListNumber"/>
-      </w:pPr>
-      <w:r>
         <w:t xml:space="preserve">Construir — </w:t>
       </w:r>
       <w:r>
@@ -2209,7 +2201,35 @@
         <w:pStyle w:val="ListNumber"/>
       </w:pPr>
       <w:r>
-        <w:t>Publicar — subir dist/ como artefacto de Pages y desplegar (actions/upload-pages-artifact + actions/deploy-pages).</w:t>
+        <w:t>Subir artefacto — actions/upload-pages-artifact@v3 con path: dist.</w:t>
+      </w:r>
+    </w:p>
+    <w:p>
+      <w:r>
+        <w:rPr>
+          <w:b/>
+          <w:i w:val="0"/>
+          <w:sz w:val="22"/>
+        </w:rPr>
+        <w:t>Job deploy (needs: build):</w:t>
+      </w:r>
+    </w:p>
+    <w:p>
+      <w:pPr>
+        <w:pStyle w:val="ListNumber"/>
+      </w:pPr>
+      <w:r>
+        <w:t>Publicar — actions/deploy-pages@v4 despliega el artefacto en el environment github-pages y expone la URL.</w:t>
+      </w:r>
+    </w:p>
+    <w:p>
+      <w:r>
+        <w:rPr>
+          <w:b w:val="0"/>
+          <w:i w:val="0"/>
+          <w:sz w:val="22"/>
+        </w:rPr>
+        <w:t>Permisos mínimos: contents:read, pages:write, id-token:write. concurrency sobre el grupo pages para que dos pushes seguidos no se pisen. Un paso de lint (Prettier/ESLint) antes de build queda como mejora futura.</w:t>
       </w:r>
     </w:p>
     <w:p>
@@ -2249,9 +2269,9 @@
         <w:br/>
         <w:t xml:space="preserve">                                             setup-node + npm ci</w:t>
         <w:br/>
-        <w:t xml:space="preserve">                                             (lint)</w:t>
+        <w:t xml:space="preserve">                                             npm run build  --&gt;  dist/</w:t>
         <w:br/>
-        <w:t xml:space="preserve">                                             npm run build  --&gt;  dist/</w:t>
+        <w:t xml:space="preserve">                                             upload-pages-artifact</w:t>
         <w:br/>
         <w:t xml:space="preserve">                                             deploy-pages   -----------&gt; GitHub Pages (CDN+HTTPS)</w:t>
         <w:br/>

</xml_diff>